<commit_message>
feat(grade7-8): complete week 6 lessons 25-28 (Pack Opening, Central Bank, SBC Solver, Auction & Deploy)
</commit_message>
<xml_diff>
--- a/assets/ISH_REJASI_7_8_SINF.docx
+++ b/assets/ISH_REJASI_7_8_SINF.docx
@@ -4849,12 +4849,7 @@
           </w:tcPr>
           <w:p>
             <w:r>
-              <w:rPr>
-                <w:rFonts w:ascii="Arial" w:hAnsi="Arial"/>
-                <w:b/>
-                <w:sz w:val="15"/>
-              </w:rPr>
-              <w:t>Sport Iqtisodiyoti va Auksion Bozorlari: Karta Paketlari va Ehtimollik</w:t>
+              <w:t>FUT Pack Opening, Central Bank &amp; Game Jam Auksion Turniri (25, 26, 27, 28-darslar)</w:t>
             </w:r>
           </w:p>
         </w:tc>
@@ -4916,11 +4911,7 @@
           </w:tcPr>
           <w:p>
             <w:r>
-              <w:rPr>
-                <w:rFonts w:ascii="Arial" w:hAnsi="Arial"/>
-                <w:sz w:val="15"/>
-              </w:rPr>
-              <w:t>Virtual valyuta balansi, Ehtimolliklar nazariyasi (Drop Rates), Karta paketlarini ochish (Pack Opening), Inflyatsiyadan himoya</w:t>
+              <w:t>Ehtimolliklar nazariyasi, CDF, Coin Sinks, SBC predikatlari (filter, reduce, Set, CSP), Auksion va Vercel deploy</w:t>
             </w:r>
           </w:p>
         </w:tc>
@@ -4937,11 +4928,7 @@
           </w:tcPr>
           <w:p>
             <w:r>
-              <w:rPr>
-                <w:rFonts w:ascii="Arial" w:hAnsi="Arial"/>
-                <w:sz w:val="15"/>
-              </w:rPr>
-              <w:t>O'yin tangalariga paketlar ochiladigan va ehtimolligi shaffof ko'rinadigan mini-iqtisodiyot studiyasi</w:t>
+              <w:t>Pack Opening Studio, Central Bank Simulator, SBC Solver va Tournament Arena loyihalari</w:t>
             </w:r>
           </w:p>
         </w:tc>
@@ -6916,12 +6903,7 @@
           </w:tcPr>
           <w:p>
             <w:r>
-              <w:rPr>
-                <w:rFonts w:ascii="Arial" w:hAnsi="Arial"/>
-                <w:b/>
-                <w:sz w:val="15"/>
-              </w:rPr>
-              <w:t>O'yin Kiberxavfsizligi: Cheat Engine va Ochkolarni Soxtalashtirishdan Himoya</w:t>
+              <w:t>FUT Pack Opening, Central Bank &amp; Game Jam Auksion Turniri (25, 26, 27, 28-darslar)</w:t>
             </w:r>
           </w:p>
         </w:tc>
@@ -6983,11 +6965,7 @@
           </w:tcPr>
           <w:p>
             <w:r>
-              <w:rPr>
-                <w:rFonts w:ascii="Arial" w:hAnsi="Arial"/>
-                <w:sz w:val="15"/>
-              </w:rPr>
-              <w:t>Xotira o'zgaruvchilarini konsoldan buzish (Variable Tampering), Xesh summasi bilan qiymatni himoyalash, Server validatsiyasi</w:t>
+              <w:t>Ehtimolliklar nazariyasi, CDF, Coin Sinks, SBC predikatlari (filter, reduce, Set, CSP), Auksion va Vercel deploy</w:t>
             </w:r>
           </w:p>
         </w:tc>
@@ -7004,11 +6982,7 @@
           </w:tcPr>
           <w:p>
             <w:r>
-              <w:rPr>
-                <w:rFonts w:ascii="Arial" w:hAnsi="Arial"/>
-                <w:sz w:val="15"/>
-              </w:rPr>
-              <w:t>O'yinchi konsol orqali ochkolarni oshirishga harakat qilsa, uni fosh qiluvchi Kiber-Qalqon moduli</w:t>
+              <w:t>Pack Opening Studio, Central Bank Simulator, SBC Solver va Tournament Arena loyihalari</w:t>
             </w:r>
           </w:p>
         </w:tc>
@@ -8983,12 +8957,7 @@
           </w:tcPr>
           <w:p>
             <w:r>
-              <w:rPr>
-                <w:rFonts w:ascii="Arial" w:hAnsi="Arial"/>
-                <w:b/>
-                <w:sz w:val="15"/>
-              </w:rPr>
-              <w:t>3-Chorak Oraliq Nazorat: 3D Sahna yoki Multiplayer O'yin Sinovi</w:t>
+              <w:t>FUT Pack Opening, Central Bank &amp; Game Jam Auksion Turniri (25, 26, 27, 28-darslar)</w:t>
             </w:r>
           </w:p>
         </w:tc>
@@ -9050,11 +9019,7 @@
           </w:tcPr>
           <w:p>
             <w:r>
-              <w:rPr>
-                <w:rFonts w:ascii="Arial" w:hAnsi="Arial"/>
-                <w:sz w:val="15"/>
-              </w:rPr>
-              <w:t>Three.js 3D grafika yoki WebSockets tarmoq kodini barqaror ishlatish, Xatolarni bartaraf etish</w:t>
+              <w:t>Ehtimolliklar nazariyasi, CDF, Coin Sinks, SBC predikatlari (filter, reduce, Set, CSP), Auksion va Vercel deploy</w:t>
             </w:r>
           </w:p>
         </w:tc>
@@ -9071,11 +9036,7 @@
           </w:tcPr>
           <w:p>
             <w:r>
-              <w:rPr>
-                <w:rFonts w:ascii="Arial" w:hAnsi="Arial"/>
-                <w:sz w:val="15"/>
-              </w:rPr>
-              <w:t>Imtihon talablariga mos keluvchi mustaqil 3D yoki ko'p o'yinchili loyiha (10 ballik mezon)</w:t>
+              <w:t>Pack Opening Studio, Central Bank Simulator, SBC Solver va Tournament Arena loyihalari</w:t>
             </w:r>
           </w:p>
         </w:tc>
@@ -11050,12 +11011,7 @@
           </w:tcPr>
           <w:p>
             <w:r>
-              <w:rPr>
-                <w:rFonts w:ascii="Arial" w:hAnsi="Arial"/>
-                <w:b/>
-                <w:sz w:val="15"/>
-              </w:rPr>
-              <w:t>Target Game Awards: Yillik O'yin Festivali va G'oliblarni Taqirlash</w:t>
+              <w:t>FUT Pack Opening, Central Bank &amp; Game Jam Auksion Turniri (25, 26, 27, 28-darslar)</w:t>
             </w:r>
           </w:p>
         </w:tc>
@@ -11117,11 +11073,7 @@
           </w:tcPr>
           <w:p>
             <w:r>
-              <w:rPr>
-                <w:rFonts w:ascii="Arial" w:hAnsi="Arial"/>
-                <w:sz w:val="15"/>
-              </w:rPr>
-              <w:t>Maktab hay'ati oldida o'yinni himoya qilish, Eng yaxshi geym-dizayn nominatsiyasida qatnashish, Bitiruv</w:t>
+              <w:t>Ehtimolliklar nazariyasi, CDF, Coin Sinks, SBC predikatlari (filter, reduce, Set, CSP), Auksion va Vercel deploy</w:t>
             </w:r>
           </w:p>
         </w:tc>
@@ -11138,11 +11090,7 @@
           </w:tcPr>
           <w:p>
             <w:r>
-              <w:rPr>
-                <w:rFonts w:ascii="Arial" w:hAnsi="Arial"/>
-                <w:sz w:val="15"/>
-              </w:rPr>
-              <w:t>Target International School Game Jam kubogi va Target IT Geym-Dizayn Oltin Diplomi</w:t>
+              <w:t>Pack Opening Studio, Central Bank Simulator, SBC Solver va Tournament Arena loyihalari</w:t>
             </w:r>
           </w:p>
         </w:tc>

</xml_diff>